<commit_message>
Phase 1-2 complete: capture, clean, score 21 originals; add planning docs
Aim 1 results (n=21 pages across TAVR/CCTA/LAAO): 0/21 meet FKGL <= 6
benchmark; median FKGL 10.4 (IQR 9.5-12.3). Aim 1 descriptives/inference
CSVs and two figures committed under reports/. Pre-registered SAP plus
deviations (5 Hopkins/Mayo pages blocked by CDN bot detection) logged.

New planning docs in docs/: project status with ordered next steps and
resume commands; cost estimates for the AI rewrite arm across the named
model panel; literature review with citation verification flags; JAMA
publishability assessment with target-journal ranking, ordered improvement
list, and alternative statistical tests per aim.
</commit_message>
<xml_diff>
--- a/docs/cardiac_readability_plan.docx
+++ b/docs/cardiac_readability_plan.docx
@@ -926,12 +926,6 @@
         <w:gridCol w:w="6240"/>
       </w:tblGrid>
       <w:tr>
-        <w:tblPrEx>
-          <w:tblCellMar>
-            <w:top w:w="0" w:type="dxa"/>
-            <w:bottom w:w="0" w:type="dxa"/>
-          </w:tblCellMar>
-        </w:tblPrEx>
         <w:tc>
           <w:tcPr>
             <w:tcW w:w="3120" w:type="dxa"/>
@@ -989,12 +983,6 @@
         </w:tc>
       </w:tr>
       <w:tr>
-        <w:tblPrEx>
-          <w:tblCellMar>
-            <w:top w:w="0" w:type="dxa"/>
-            <w:bottom w:w="0" w:type="dxa"/>
-          </w:tblCellMar>
-        </w:tblPrEx>
         <w:tc>
           <w:tcPr>
             <w:tcW w:w="3120" w:type="dxa"/>
@@ -1035,18 +1023,12 @@
           </w:tcPr>
           <w:p>
             <w:r>
-              <w:t>Mentee</w:t>
+              <w:t>Abdul</w:t>
             </w:r>
           </w:p>
         </w:tc>
       </w:tr>
       <w:tr>
-        <w:tblPrEx>
-          <w:tblCellMar>
-            <w:top w:w="0" w:type="dxa"/>
-            <w:bottom w:w="0" w:type="dxa"/>
-          </w:tblCellMar>
-        </w:tblPrEx>
         <w:tc>
           <w:tcPr>
             <w:tcW w:w="3120" w:type="dxa"/>
@@ -1087,18 +1069,12 @@
           </w:tcPr>
           <w:p>
             <w:r>
-              <w:t>Mentee</w:t>
+              <w:t>Abdul</w:t>
             </w:r>
           </w:p>
         </w:tc>
       </w:tr>
       <w:tr>
-        <w:tblPrEx>
-          <w:tblCellMar>
-            <w:top w:w="0" w:type="dxa"/>
-            <w:bottom w:w="0" w:type="dxa"/>
-          </w:tblCellMar>
-        </w:tblPrEx>
         <w:tc>
           <w:tcPr>
             <w:tcW w:w="3120" w:type="dxa"/>
@@ -1147,18 +1123,15 @@
           </w:tcPr>
           <w:p>
             <w:r>
-              <w:t>Mentee (AI PhD — good fit)</w:t>
+              <w:t>Abdul</w:t>
+            </w:r>
+            <w:r>
+              <w:t xml:space="preserve"> (AI PhD — good fit)</w:t>
             </w:r>
           </w:p>
         </w:tc>
       </w:tr>
       <w:tr>
-        <w:tblPrEx>
-          <w:tblCellMar>
-            <w:top w:w="0" w:type="dxa"/>
-            <w:bottom w:w="0" w:type="dxa"/>
-          </w:tblCellMar>
-        </w:tblPrEx>
         <w:tc>
           <w:tcPr>
             <w:tcW w:w="3120" w:type="dxa"/>
@@ -1199,18 +1172,12 @@
           </w:tcPr>
           <w:p>
             <w:r>
-              <w:t>Mentee</w:t>
+              <w:t>Abdul</w:t>
             </w:r>
           </w:p>
         </w:tc>
       </w:tr>
       <w:tr>
-        <w:tblPrEx>
-          <w:tblCellMar>
-            <w:top w:w="0" w:type="dxa"/>
-            <w:bottom w:w="0" w:type="dxa"/>
-          </w:tblCellMar>
-        </w:tblPrEx>
         <w:tc>
           <w:tcPr>
             <w:tcW w:w="3120" w:type="dxa"/>
@@ -1257,12 +1224,6 @@
         </w:tc>
       </w:tr>
       <w:tr>
-        <w:tblPrEx>
-          <w:tblCellMar>
-            <w:top w:w="0" w:type="dxa"/>
-            <w:bottom w:w="0" w:type="dxa"/>
-          </w:tblCellMar>
-        </w:tblPrEx>
         <w:tc>
           <w:tcPr>
             <w:tcW w:w="3120" w:type="dxa"/>
@@ -1303,18 +1264,15 @@
           </w:tcPr>
           <w:p>
             <w:r>
-              <w:t>Mentee + biostatistician check</w:t>
+              <w:t>Abdul</w:t>
+            </w:r>
+            <w:r>
+              <w:t xml:space="preserve"> + biostatistician check</w:t>
             </w:r>
           </w:p>
         </w:tc>
       </w:tr>
       <w:tr>
-        <w:tblPrEx>
-          <w:tblCellMar>
-            <w:top w:w="0" w:type="dxa"/>
-            <w:bottom w:w="0" w:type="dxa"/>
-          </w:tblCellMar>
-        </w:tblPrEx>
         <w:tc>
           <w:tcPr>
             <w:tcW w:w="3120" w:type="dxa"/>
@@ -1391,12 +1349,6 @@
         <w:gridCol w:w="6960"/>
       </w:tblGrid>
       <w:tr>
-        <w:tblPrEx>
-          <w:tblCellMar>
-            <w:top w:w="0" w:type="dxa"/>
-            <w:bottom w:w="0" w:type="dxa"/>
-          </w:tblCellMar>
-        </w:tblPrEx>
         <w:tc>
           <w:tcPr>
             <w:tcW w:w="2400" w:type="dxa"/>
@@ -1453,12 +1405,6 @@
         </w:tc>
       </w:tr>
       <w:tr>
-        <w:tblPrEx>
-          <w:tblCellMar>
-            <w:top w:w="0" w:type="dxa"/>
-            <w:bottom w:w="0" w:type="dxa"/>
-          </w:tblCellMar>
-        </w:tblPrEx>
         <w:tc>
           <w:tcPr>
             <w:tcW w:w="2400" w:type="dxa"/>
@@ -1505,12 +1451,6 @@
         </w:tc>
       </w:tr>
       <w:tr>
-        <w:tblPrEx>
-          <w:tblCellMar>
-            <w:top w:w="0" w:type="dxa"/>
-            <w:bottom w:w="0" w:type="dxa"/>
-          </w:tblCellMar>
-        </w:tblPrEx>
         <w:tc>
           <w:tcPr>
             <w:tcW w:w="2400" w:type="dxa"/>
@@ -1557,12 +1497,6 @@
         </w:tc>
       </w:tr>
       <w:tr>
-        <w:tblPrEx>
-          <w:tblCellMar>
-            <w:top w:w="0" w:type="dxa"/>
-            <w:bottom w:w="0" w:type="dxa"/>
-          </w:tblCellMar>
-        </w:tblPrEx>
         <w:tc>
           <w:tcPr>
             <w:tcW w:w="2400" w:type="dxa"/>
@@ -1609,12 +1543,6 @@
         </w:tc>
       </w:tr>
       <w:tr>
-        <w:tblPrEx>
-          <w:tblCellMar>
-            <w:top w:w="0" w:type="dxa"/>
-            <w:bottom w:w="0" w:type="dxa"/>
-          </w:tblCellMar>
-        </w:tblPrEx>
         <w:tc>
           <w:tcPr>
             <w:tcW w:w="2400" w:type="dxa"/>
@@ -1661,12 +1589,6 @@
         </w:tc>
       </w:tr>
       <w:tr>
-        <w:tblPrEx>
-          <w:tblCellMar>
-            <w:top w:w="0" w:type="dxa"/>
-            <w:bottom w:w="0" w:type="dxa"/>
-          </w:tblCellMar>
-        </w:tblPrEx>
         <w:tc>
           <w:tcPr>
             <w:tcW w:w="2400" w:type="dxa"/>
@@ -1713,12 +1635,6 @@
         </w:tc>
       </w:tr>
       <w:tr>
-        <w:tblPrEx>
-          <w:tblCellMar>
-            <w:top w:w="0" w:type="dxa"/>
-            <w:bottom w:w="0" w:type="dxa"/>
-          </w:tblCellMar>
-        </w:tblPrEx>
         <w:tc>
           <w:tcPr>
             <w:tcW w:w="2400" w:type="dxa"/>
@@ -1765,12 +1681,6 @@
         </w:tc>
       </w:tr>
       <w:tr>
-        <w:tblPrEx>
-          <w:tblCellMar>
-            <w:top w:w="0" w:type="dxa"/>
-            <w:bottom w:w="0" w:type="dxa"/>
-          </w:tblCellMar>
-        </w:tblPrEx>
         <w:tc>
           <w:tcPr>
             <w:tcW w:w="2400" w:type="dxa"/>

</xml_diff>